<commit_message>
Atulização de Readme com detalhes do projeto, incluindo instruções de deploy e execução do app.
</commit_message>
<xml_diff>
--- a/cronograma_status_3w.docx
+++ b/cronograma_status_3w.docx
@@ -36,7 +36,7 @@
           <w:color w:val="505050"/>
           <w:sz w:val="18"/>
         </w:rPr>
-        <w:t>Alan Pinheiro da Silva  |  USP Escola Politécnica  |  eEDB-007  |  Atualização: 21/06/2026 (v6)</w:t>
+        <w:t>Alan Pinheiro da Silva  |  USP Escola Politécnica  |  eEDB-007  |  Atualização: 24/06/2026 (v7)</w:t>
       </w:r>
     </w:p>
     <w:p/>
@@ -172,7 +172,7 @@
         <w:pStyle w:val="Heading2"/>
       </w:pPr>
       <w:r>
-        <w:t>1. Resumo Geral — Posição em 21/06/2026</w:t>
+        <w:t>1. Resumo Geral — Posição em 24/06/2026</w:t>
       </w:r>
     </w:p>
     <w:tbl>
@@ -1036,7 +1036,7 @@
                 <w:b w:val="0"/>
                 <w:sz w:val="18"/>
               </w:rPr>
-              <w:t>monografia_v6.docx — Caps. 1–3.6 completos. Caps. 3.7–3.9 (ML, SHAP, Thresholds) a inserir. Cap. 4 a revisar.</w:t>
+              <w:t>monografia_v2.docx — Caps. 1–4 estruturados. ABNT aplicada, sumário TOC ativo. Revisão final + Cap. 5 (Conclusão) pendentes.</w:t>
             </w:r>
           </w:p>
         </w:tc>
@@ -1116,7 +1116,7 @@
         <w:tc>
           <w:tcPr>
             <w:tcW w:type="dxa" w:w="1814"/>
-            <w:shd w:val="clear" w:color="auto" w:fill="F5F5F5"/>
+            <w:shd w:val="clear" w:color="auto" w:fill="D0E4FF"/>
             <w:tcBorders>
               <w:top w:val="single" w:sz="4" w:space="0" w:color="BBBBBB"/>
               <w:left w:val="single" w:sz="4" w:space="0" w:color="BBBBBB"/>
@@ -1131,10 +1131,10 @@
             <w:r>
               <w:rPr>
                 <w:b/>
-                <w:color w:val="505050"/>
+                <w:color w:val="1A5276"/>
                 <w:sz w:val="18"/>
               </w:rPr>
-              <w:t>PENDENTE</w:t>
+              <w:t>EM ANDAMENTO</w:t>
             </w:r>
           </w:p>
         </w:tc>
@@ -1157,7 +1157,7 @@
                 <w:b w:val="0"/>
                 <w:sz w:val="18"/>
               </w:rPr>
-              <w:t>Terraform pronto (diretório terraform/). Deploy após validação final dos modelos ML.</w:t>
+              <w:t xml:space="preserve">EC2 t3.large + S3 operacionais (AWS Academy). Pipeline ETL completo na nuvem: 501 arquivos, 7,48M linhas, 136 features. Pendente: fix OOM return + ML training na nuvem.</w:t>
             </w:r>
           </w:p>
         </w:tc>
@@ -2881,7 +2881,7 @@
                 <w:b/>
                 <w:sz w:val="18"/>
               </w:rPr>
-              <w:t>monografia_v6.docx</w:t>
+              <w:t>monografia_v2.docx</w:t>
             </w:r>
           </w:p>
         </w:tc>
@@ -3422,7 +3422,7 @@
         <w:pStyle w:val="Heading2"/>
       </w:pPr>
       <w:r>
-        <w:t>5. Próximos Passos — Sprint 21/06–31/07/2026</w:t>
+        <w:t>5. Próximos Passos — Sprint 24/06–31/07/2026</w:t>
       </w:r>
     </w:p>
     <w:tbl>
@@ -3800,7 +3800,7 @@
                 <w:b w:val="0"/>
                 <w:sz w:val="18"/>
               </w:rPr>
-              <w:t>git add monografia_v6.docx cronograma_status_3w.docx &amp;&amp; git tag v0.6-monografia</w:t>
+              <w:t>git add monografia_v2.docx cronograma_status_3w.docx README.md &amp;&amp; git tag v0.7-aws-pipeline</w:t>
             </w:r>
           </w:p>
         </w:tc>
@@ -4089,7 +4089,7 @@
                 <w:b/>
                 <w:sz w:val="18"/>
               </w:rPr>
-              <w:t>Deploy AWS — infraestrutura Terraform</w:t>
+              <w:t>Finalizar pipeline AWS + ML training na nuvem</w:t>
             </w:r>
           </w:p>
         </w:tc>
@@ -4160,7 +4160,7 @@
                 <w:b w:val="0"/>
                 <w:sz w:val="18"/>
               </w:rPr>
-              <w:t>S3 buckets Bronze/Silver/Gold + Glue Jobs + Step Functions para pipeline de produção.</w:t>
+              <w:t>EC2 + S3 operacionais. Fix OOM return (git push + pull EC2). Rodar dag_etl + dag_ml_training na nuvem. Sync gold → S3.</w:t>
             </w:r>
           </w:p>
         </w:tc>
@@ -4536,7 +4536,7 @@
           <w:color w:val="787878"/>
           <w:sz w:val="16"/>
         </w:rPr>
-        <w:t>Repositório GitHub: projeto-3w-aws  |  Diretório principal: D:\Alan\Alan\Pos GRADUAÇÃO USP\eEDB-007 - Trabalho de Conclusão\projeto-3w-aws  |  Versão do documento: v6 — 21/06/2026</w:t>
+        <w:t>Repositório GitHub: projeto-3w-aws  |  Diretório principal: D:\Alan\Alan\Pos GRADUAÇÃO USP\eEDB-007 - Trabalho de Conclusão\projeto-3w-aws  |  Versão do documento: v7 — 24/06/2026</w:t>
       </w:r>
     </w:p>
     <w:sectPr>

</xml_diff>